<commit_message>
docs: add VS Code interface walkthrough to setup guide
</commit_message>
<xml_diff>
--- a/docs/workshop-setup-guide.docx
+++ b/docs/workshop-setup-guide.docx
@@ -103,7 +103,7 @@
           <w:sz w:val="22"/>
           <w:szCs w:val="22"/>
         </w:rPr>
-        <w:t xml:space="preserve">，順序有原因（第 2 節會看到）。做完後用第 5 節的三行指令自我檢查，三項全過才算完成。</w:t>
+        <w:t xml:space="preserve">，順序有原因（第 2 節會看到）。做完後用第 6 節的三行指令自我檢查，三項全過才算完成。</w:t>
       </w:r>
     </w:p>
     <w:p>
@@ -531,7 +531,7 @@
                 <w:sz w:val="20"/>
                 <w:szCs w:val="20"/>
               </w:rPr>
-              <w:t xml:space="preserve">5. 第 5 節的三行檢查指令全部通過</w:t>
+              <w:t xml:space="preserve">5. 第 6 節的三行檢查指令全部通過</w:t>
             </w:r>
           </w:p>
         </w:tc>
@@ -2205,7 +2205,619 @@
           <w:sz w:val="30"/>
           <w:szCs w:val="30"/>
         </w:rPr>
-        <w:t xml:space="preserve">4｜安裝 R 套件（需要網路，請課前完成）</w:t>
+        <w:t xml:space="preserve">4｜認識 VS Code 介面（裝完 Git 和 R，VS Code 就全部就緒）</w:t>
+      </w:r>
+    </w:p>
+    <w:p>
+      <w:pPr>
+        <w:spacing w:after="120" w:line="300"/>
+      </w:pPr>
+      <w:r>
+        <w:rPr>
+          <w:rFonts w:ascii="Microsoft JhengHei" w:eastAsia="Microsoft JhengHei" w:hAnsi="Microsoft JhengHei"/>
+          <w:sz w:val="22"/>
+          <w:szCs w:val="22"/>
+        </w:rPr>
+        <w:t xml:space="preserve">裝好 Git 之後，</w:t>
+      </w:r>
+      <w:r>
+        <w:rPr>
+          <w:rFonts w:ascii="Microsoft JhengHei" w:eastAsia="Microsoft JhengHei" w:hAnsi="Microsoft JhengHei"/>
+          <w:b/>
+          <w:bCs/>
+          <w:sz w:val="22"/>
+          <w:szCs w:val="22"/>
+        </w:rPr>
+        <w:t xml:space="preserve">VS Code 會自動偵測到它，不需要任何設定</w:t>
+      </w:r>
+      <w:r>
+        <w:rPr>
+          <w:rFonts w:ascii="Microsoft JhengHei" w:eastAsia="Microsoft JhengHei" w:hAnsi="Microsoft JhengHei"/>
+          <w:sz w:val="22"/>
+          <w:szCs w:val="22"/>
+        </w:rPr>
+        <w:t xml:space="preserve">——左側的源代碼管理面板和終端機裡的 git 指令馬上就能用。R 則不會在畫面上出現任何按鈕，一律透過終端機使用。這一節帶你認識畫面上的五個區塊，工作坊當天用到的就只有這些。</w:t>
+      </w:r>
+    </w:p>
+    <w:p>
+      <w:pPr>
+        <w:spacing w:after="40" w:before="120"/>
+        <w:jc w:val="center"/>
+      </w:pPr>
+      <w:r>
+        <w:drawing>
+          <wp:inline distT="0" distB="0" distL="0" distR="0">
+            <wp:extent cx="5619750" cy="3609975"/>
+            <wp:effectExtent t="0" r="0" b="0" l="0"/>
+            <wp:docPr id="1" name="" descr="" title=""/>
+            <wp:cNvGraphicFramePr>
+              <a:graphicFrameLocks xmlns:a="http://schemas.openxmlformats.org/drawingml/2006/main" noChangeAspect="1"/>
+            </wp:cNvGraphicFramePr>
+            <a:graphic xmlns:a="http://schemas.openxmlformats.org/drawingml/2006/main">
+              <a:graphicData uri="http://schemas.openxmlformats.org/drawingml/2006/picture">
+                <pic:pic xmlns:pic="http://schemas.openxmlformats.org/drawingml/2006/picture">
+                  <pic:nvPicPr>
+                    <pic:cNvPr id="0" name="" descr=""/>
+                    <pic:cNvPicPr>
+                      <a:picLocks noChangeAspect="1" noChangeArrowheads="1"/>
+                    </pic:cNvPicPr>
+                  </pic:nvPicPr>
+                  <pic:blipFill>
+                    <a:blip r:embed="rId12" cstate="none"/>
+                    <a:srcRect/>
+                    <a:stretch>
+                      <a:fillRect/>
+                    </a:stretch>
+                  </pic:blipFill>
+                  <pic:spPr bwMode="auto">
+                    <a:xfrm>
+                      <a:off x="0" y="0"/>
+                      <a:ext cx="5619750" cy="3609975"/>
+                    </a:xfrm>
+                    <a:prstGeom prst="rect">
+                      <a:avLst/>
+                    </a:prstGeom>
+                  </pic:spPr>
+                </pic:pic>
+              </a:graphicData>
+            </a:graphic>
+          </wp:inline>
+        </w:drawing>
+      </w:r>
+    </w:p>
+    <w:p>
+      <w:pPr>
+        <w:spacing w:after="200"/>
+        <w:jc w:val="center"/>
+      </w:pPr>
+      <w:r>
+        <w:rPr>
+          <w:rFonts w:ascii="Microsoft JhengHei" w:eastAsia="Microsoft JhengHei" w:hAnsi="Microsoft JhengHei"/>
+          <w:i/>
+          <w:iCs/>
+          <w:color w:val="595959"/>
+          <w:sz w:val="18"/>
+          <w:szCs w:val="18"/>
+        </w:rPr>
+        <w:t xml:space="preserve">圖 6｜VS Code 主畫面五大區塊（示意圖——標註為本指南所加，實際配色依版本與佈景主題略有差異）</w:t>
+      </w:r>
+    </w:p>
+    <w:p>
+      <w:pPr>
+        <w:spacing w:after="100" w:line="300"/>
+        <w:ind w:left="360" w:hanging="360"/>
+      </w:pPr>
+      <w:r>
+        <w:rPr>
+          <w:rFonts w:ascii="Microsoft JhengHei" w:eastAsia="Microsoft JhengHei" w:hAnsi="Microsoft JhengHei"/>
+          <w:b/>
+          <w:bCs/>
+          <w:sz w:val="22"/>
+          <w:szCs w:val="22"/>
+        </w:rPr>
+        <w:t xml:space="preserve">①  </w:t>
+      </w:r>
+      <w:r>
+        <w:rPr>
+          <w:rFonts w:ascii="Microsoft JhengHei" w:eastAsia="Microsoft JhengHei" w:hAnsi="Microsoft JhengHei"/>
+          <w:b/>
+          <w:bCs/>
+          <w:sz w:val="22"/>
+          <w:szCs w:val="22"/>
+        </w:rPr>
+        <w:t xml:space="preserve">功能表列</w:t>
+      </w:r>
+      <w:r>
+        <w:rPr>
+          <w:rFonts w:ascii="Microsoft JhengHei" w:eastAsia="Microsoft JhengHei" w:hAnsi="Microsoft JhengHei"/>
+          <w:sz w:val="22"/>
+          <w:szCs w:val="22"/>
+        </w:rPr>
+        <w:t xml:space="preserve">　當天最常用的兩個選單：</w:t>
+      </w:r>
+      <w:r>
+        <w:rPr>
+          <w:rFonts w:ascii="Microsoft JhengHei" w:eastAsia="Microsoft JhengHei" w:hAnsi="Microsoft JhengHei"/>
+          <w:b/>
+          <w:bCs/>
+          <w:sz w:val="22"/>
+          <w:szCs w:val="22"/>
+        </w:rPr>
+        <w:t xml:space="preserve">File → Open Folder</w:t>
+      </w:r>
+      <w:r>
+        <w:rPr>
+          <w:rFonts w:ascii="Microsoft JhengHei" w:eastAsia="Microsoft JhengHei" w:hAnsi="Microsoft JhengHei"/>
+          <w:sz w:val="22"/>
+          <w:szCs w:val="22"/>
+        </w:rPr>
+        <w:t xml:space="preserve">（開啟專案資料夾）和 </w:t>
+      </w:r>
+      <w:r>
+        <w:rPr>
+          <w:rFonts w:ascii="Microsoft JhengHei" w:eastAsia="Microsoft JhengHei" w:hAnsi="Microsoft JhengHei"/>
+          <w:b/>
+          <w:bCs/>
+          <w:sz w:val="22"/>
+          <w:szCs w:val="22"/>
+        </w:rPr>
+        <w:t xml:space="preserve">Terminal → New Terminal</w:t>
+      </w:r>
+      <w:r>
+        <w:rPr>
+          <w:rFonts w:ascii="Microsoft JhengHei" w:eastAsia="Microsoft JhengHei" w:hAnsi="Microsoft JhengHei"/>
+          <w:sz w:val="22"/>
+          <w:szCs w:val="22"/>
+        </w:rPr>
+        <w:t xml:space="preserve">（開終端機）。</w:t>
+      </w:r>
+    </w:p>
+    <w:p>
+      <w:pPr>
+        <w:spacing w:after="100" w:line="300"/>
+        <w:ind w:left="360" w:hanging="360"/>
+      </w:pPr>
+      <w:r>
+        <w:rPr>
+          <w:rFonts w:ascii="Microsoft JhengHei" w:eastAsia="Microsoft JhengHei" w:hAnsi="Microsoft JhengHei"/>
+          <w:b/>
+          <w:bCs/>
+          <w:sz w:val="22"/>
+          <w:szCs w:val="22"/>
+        </w:rPr>
+        <w:t xml:space="preserve">②  </w:t>
+      </w:r>
+      <w:r>
+        <w:rPr>
+          <w:rFonts w:ascii="Microsoft JhengHei" w:eastAsia="Microsoft JhengHei" w:hAnsi="Microsoft JhengHei"/>
+          <w:b/>
+          <w:bCs/>
+          <w:sz w:val="22"/>
+          <w:szCs w:val="22"/>
+        </w:rPr>
+        <w:t xml:space="preserve">活動列</w:t>
+      </w:r>
+      <w:r>
+        <w:rPr>
+          <w:rFonts w:ascii="Microsoft JhengHei" w:eastAsia="Microsoft JhengHei" w:hAnsi="Microsoft JhengHei"/>
+          <w:sz w:val="22"/>
+          <w:szCs w:val="22"/>
+        </w:rPr>
+        <w:t xml:space="preserve">　由上而下依序是：檔案總管、搜尋、</w:t>
+      </w:r>
+      <w:r>
+        <w:rPr>
+          <w:rFonts w:ascii="Microsoft JhengHei" w:eastAsia="Microsoft JhengHei" w:hAnsi="Microsoft JhengHei"/>
+          <w:b/>
+          <w:bCs/>
+          <w:sz w:val="22"/>
+          <w:szCs w:val="22"/>
+        </w:rPr>
+        <w:t xml:space="preserve">源代碼管理（Git 的分岔圖示）</w:t>
+      </w:r>
+      <w:r>
+        <w:rPr>
+          <w:rFonts w:ascii="Microsoft JhengHei" w:eastAsia="Microsoft JhengHei" w:hAnsi="Microsoft JhengHei"/>
+          <w:sz w:val="22"/>
+          <w:szCs w:val="22"/>
+        </w:rPr>
+        <w:t xml:space="preserve">、執行與除錯、延伸模組。裝好 Git 後，源代碼管理面板會自動列出你改過的檔案。</w:t>
+      </w:r>
+    </w:p>
+    <w:p>
+      <w:pPr>
+        <w:spacing w:after="100" w:line="300"/>
+        <w:ind w:left="360" w:hanging="360"/>
+      </w:pPr>
+      <w:r>
+        <w:rPr>
+          <w:rFonts w:ascii="Microsoft JhengHei" w:eastAsia="Microsoft JhengHei" w:hAnsi="Microsoft JhengHei"/>
+          <w:b/>
+          <w:bCs/>
+          <w:sz w:val="22"/>
+          <w:szCs w:val="22"/>
+        </w:rPr>
+        <w:t xml:space="preserve">③  </w:t>
+      </w:r>
+      <w:r>
+        <w:rPr>
+          <w:rFonts w:ascii="Microsoft JhengHei" w:eastAsia="Microsoft JhengHei" w:hAnsi="Microsoft JhengHei"/>
+          <w:b/>
+          <w:bCs/>
+          <w:sz w:val="22"/>
+          <w:szCs w:val="22"/>
+        </w:rPr>
+        <w:t xml:space="preserve">檔案總管</w:t>
+      </w:r>
+      <w:r>
+        <w:rPr>
+          <w:rFonts w:ascii="Microsoft JhengHei" w:eastAsia="Microsoft JhengHei" w:hAnsi="Microsoft JhengHei"/>
+          <w:sz w:val="22"/>
+          <w:szCs w:val="22"/>
+        </w:rPr>
+        <w:t xml:space="preserve">　顯示目前開啟資料夾的檔案樹，點任何檔案就會在右邊的編輯區打開。</w:t>
+      </w:r>
+    </w:p>
+    <w:p>
+      <w:pPr>
+        <w:spacing w:after="100" w:line="300"/>
+        <w:ind w:left="360" w:hanging="360"/>
+      </w:pPr>
+      <w:r>
+        <w:rPr>
+          <w:rFonts w:ascii="Microsoft JhengHei" w:eastAsia="Microsoft JhengHei" w:hAnsi="Microsoft JhengHei"/>
+          <w:b/>
+          <w:bCs/>
+          <w:sz w:val="22"/>
+          <w:szCs w:val="22"/>
+        </w:rPr>
+        <w:t xml:space="preserve">④  </w:t>
+      </w:r>
+      <w:r>
+        <w:rPr>
+          <w:rFonts w:ascii="Microsoft JhengHei" w:eastAsia="Microsoft JhengHei" w:hAnsi="Microsoft JhengHei"/>
+          <w:b/>
+          <w:bCs/>
+          <w:sz w:val="22"/>
+          <w:szCs w:val="22"/>
+        </w:rPr>
+        <w:t xml:space="preserve">編輯區</w:t>
+      </w:r>
+      <w:r>
+        <w:rPr>
+          <w:rFonts w:ascii="Microsoft JhengHei" w:eastAsia="Microsoft JhengHei" w:hAnsi="Microsoft JhengHei"/>
+          <w:sz w:val="22"/>
+          <w:szCs w:val="22"/>
+        </w:rPr>
+        <w:t xml:space="preserve">　看程式碼、改程式碼的地方。</w:t>
+      </w:r>
+    </w:p>
+    <w:p>
+      <w:pPr>
+        <w:spacing w:after="100" w:line="300"/>
+        <w:ind w:left="360" w:hanging="360"/>
+      </w:pPr>
+      <w:r>
+        <w:rPr>
+          <w:rFonts w:ascii="Microsoft JhengHei" w:eastAsia="Microsoft JhengHei" w:hAnsi="Microsoft JhengHei"/>
+          <w:b/>
+          <w:bCs/>
+          <w:sz w:val="22"/>
+          <w:szCs w:val="22"/>
+        </w:rPr>
+        <w:t xml:space="preserve">⑤  </w:t>
+      </w:r>
+      <w:r>
+        <w:rPr>
+          <w:rFonts w:ascii="Microsoft JhengHei" w:eastAsia="Microsoft JhengHei" w:hAnsi="Microsoft JhengHei"/>
+          <w:b/>
+          <w:bCs/>
+          <w:sz w:val="22"/>
+          <w:szCs w:val="22"/>
+        </w:rPr>
+        <w:t xml:space="preserve">終端機面板</w:t>
+      </w:r>
+      <w:r>
+        <w:rPr>
+          <w:rFonts w:ascii="Microsoft JhengHei" w:eastAsia="Microsoft JhengHei" w:hAnsi="Microsoft JhengHei"/>
+          <w:sz w:val="22"/>
+          <w:szCs w:val="22"/>
+        </w:rPr>
+        <w:t xml:space="preserve">　</w:t>
+      </w:r>
+      <w:r>
+        <w:rPr>
+          <w:rFonts w:ascii="Microsoft JhengHei" w:eastAsia="Microsoft JhengHei" w:hAnsi="Microsoft JhengHei"/>
+          <w:b/>
+          <w:bCs/>
+          <w:color w:val="C00000"/>
+          <w:sz w:val="22"/>
+          <w:szCs w:val="22"/>
+        </w:rPr>
+        <w:t xml:space="preserve">本工作坊的主戰場</w:t>
+      </w:r>
+      <w:r>
+        <w:rPr>
+          <w:rFonts w:ascii="Microsoft JhengHei" w:eastAsia="Microsoft JhengHei" w:hAnsi="Microsoft JhengHei"/>
+          <w:sz w:val="22"/>
+          <w:szCs w:val="22"/>
+        </w:rPr>
+        <w:t xml:space="preserve">——git、R、Rscript 全部在這裡輸入。最下面的藍色狀態列左端會顯示目前的 Git 分支（例如 main）。</w:t>
+      </w:r>
+    </w:p>
+    <w:p>
+      <w:pPr>
+        <w:spacing w:after="120" w:before="240"/>
+      </w:pPr>
+      <w:r>
+        <w:rPr>
+          <w:rFonts w:ascii="Microsoft JhengHei" w:eastAsia="Microsoft JhengHei" w:hAnsi="Microsoft JhengHei"/>
+          <w:b/>
+          <w:bCs/>
+          <w:color w:val="2E74B5"/>
+          <w:sz w:val="24"/>
+          <w:szCs w:val="24"/>
+        </w:rPr>
+        <w:t xml:space="preserve">4-1　Git 在 VS Code 的兩種用法</w:t>
+      </w:r>
+    </w:p>
+    <w:p>
+      <w:pPr>
+        <w:spacing w:after="120" w:line="300"/>
+      </w:pPr>
+      <w:r>
+        <w:rPr>
+          <w:rFonts w:ascii="Microsoft JhengHei" w:eastAsia="Microsoft JhengHei" w:hAnsi="Microsoft JhengHei"/>
+          <w:sz w:val="22"/>
+          <w:szCs w:val="22"/>
+        </w:rPr>
+        <w:t xml:space="preserve">最直接的是在</w:t>
+      </w:r>
+      <w:r>
+        <w:rPr>
+          <w:rFonts w:ascii="Microsoft JhengHei" w:eastAsia="Microsoft JhengHei" w:hAnsi="Microsoft JhengHei"/>
+          <w:b/>
+          <w:bCs/>
+          <w:sz w:val="22"/>
+          <w:szCs w:val="22"/>
+        </w:rPr>
+        <w:t xml:space="preserve">終端機打 git 指令</w:t>
+      </w:r>
+      <w:r>
+        <w:rPr>
+          <w:rFonts w:ascii="Microsoft JhengHei" w:eastAsia="Microsoft JhengHei" w:hAnsi="Microsoft JhengHei"/>
+          <w:sz w:val="22"/>
+          <w:szCs w:val="22"/>
+        </w:rPr>
+        <w:t xml:space="preserve">（本指南和工作坊採用的方式）。另一種是圖形介面：按 </w:t>
+      </w:r>
+      <w:r>
+        <w:rPr>
+          <w:rFonts w:ascii="Microsoft JhengHei" w:eastAsia="Microsoft JhengHei" w:hAnsi="Microsoft JhengHei"/>
+          <w:b/>
+          <w:bCs/>
+          <w:sz w:val="22"/>
+          <w:szCs w:val="22"/>
+        </w:rPr>
+        <w:t xml:space="preserve">Ctrl + Shift + P</w:t>
+      </w:r>
+      <w:r>
+        <w:rPr>
+          <w:rFonts w:ascii="Microsoft JhengHei" w:eastAsia="Microsoft JhengHei" w:hAnsi="Microsoft JhengHei"/>
+          <w:sz w:val="22"/>
+          <w:szCs w:val="22"/>
+        </w:rPr>
+        <w:t xml:space="preserve"> 打開「指令面板」，輸入 git clone，選第一項「</w:t>
+      </w:r>
+      <w:r>
+        <w:rPr>
+          <w:rFonts w:ascii="Microsoft JhengHei" w:eastAsia="Microsoft JhengHei" w:hAnsi="Microsoft JhengHei"/>
+          <w:b/>
+          <w:bCs/>
+          <w:sz w:val="22"/>
+          <w:szCs w:val="22"/>
+        </w:rPr>
+        <w:t xml:space="preserve">Git: Clone</w:t>
+      </w:r>
+      <w:r>
+        <w:rPr>
+          <w:rFonts w:ascii="Microsoft JhengHei" w:eastAsia="Microsoft JhengHei" w:hAnsi="Microsoft JhengHei"/>
+          <w:sz w:val="22"/>
+          <w:szCs w:val="22"/>
+        </w:rPr>
+        <w:t xml:space="preserve">」再貼上專案網址——效果和終端機打指令完全一樣，挑順手的用即可。</w:t>
+      </w:r>
+    </w:p>
+    <w:p>
+      <w:pPr>
+        <w:spacing w:after="40" w:before="120"/>
+        <w:jc w:val="center"/>
+      </w:pPr>
+      <w:r>
+        <w:drawing>
+          <wp:inline distT="0" distB="0" distL="0" distR="0">
+            <wp:extent cx="5619750" cy="2486025"/>
+            <wp:effectExtent t="0" r="0" b="0" l="0"/>
+            <wp:docPr id="1" name="" descr="" title=""/>
+            <wp:cNvGraphicFramePr>
+              <a:graphicFrameLocks xmlns:a="http://schemas.openxmlformats.org/drawingml/2006/main" noChangeAspect="1"/>
+            </wp:cNvGraphicFramePr>
+            <a:graphic xmlns:a="http://schemas.openxmlformats.org/drawingml/2006/main">
+              <a:graphicData uri="http://schemas.openxmlformats.org/drawingml/2006/picture">
+                <pic:pic xmlns:pic="http://schemas.openxmlformats.org/drawingml/2006/picture">
+                  <pic:nvPicPr>
+                    <pic:cNvPr id="0" name="" descr=""/>
+                    <pic:cNvPicPr>
+                      <a:picLocks noChangeAspect="1" noChangeArrowheads="1"/>
+                    </pic:cNvPicPr>
+                  </pic:nvPicPr>
+                  <pic:blipFill>
+                    <a:blip r:embed="rId13" cstate="none"/>
+                    <a:srcRect/>
+                    <a:stretch>
+                      <a:fillRect/>
+                    </a:stretch>
+                  </pic:blipFill>
+                  <pic:spPr bwMode="auto">
+                    <a:xfrm>
+                      <a:off x="0" y="0"/>
+                      <a:ext cx="5619750" cy="2486025"/>
+                    </a:xfrm>
+                    <a:prstGeom prst="rect">
+                      <a:avLst/>
+                    </a:prstGeom>
+                  </pic:spPr>
+                </pic:pic>
+              </a:graphicData>
+            </a:graphic>
+          </wp:inline>
+        </w:drawing>
+      </w:r>
+    </w:p>
+    <w:p>
+      <w:pPr>
+        <w:spacing w:after="200"/>
+        <w:jc w:val="center"/>
+      </w:pPr>
+      <w:r>
+        <w:rPr>
+          <w:rFonts w:ascii="Microsoft JhengHei" w:eastAsia="Microsoft JhengHei" w:hAnsi="Microsoft JhengHei"/>
+          <w:i/>
+          <w:iCs/>
+          <w:color w:val="595959"/>
+          <w:sz w:val="18"/>
+          <w:szCs w:val="18"/>
+        </w:rPr>
+        <w:t xml:space="preserve">圖 7｜Ctrl+Shift+P 指令面板：輸入 git clone、選 Git: Clone，就是圖形化的 clone（示意圖）</w:t>
+      </w:r>
+    </w:p>
+    <w:p>
+      <w:pPr>
+        <w:spacing w:after="120" w:before="240"/>
+      </w:pPr>
+      <w:r>
+        <w:rPr>
+          <w:rFonts w:ascii="Microsoft JhengHei" w:eastAsia="Microsoft JhengHei" w:hAnsi="Microsoft JhengHei"/>
+          <w:b/>
+          <w:bCs/>
+          <w:color w:val="2E74B5"/>
+          <w:sz w:val="24"/>
+          <w:szCs w:val="24"/>
+        </w:rPr>
+        <w:t xml:space="preserve">4-2　R 在 VS Code 怎麼用</w:t>
+      </w:r>
+    </w:p>
+    <w:p>
+      <w:pPr>
+        <w:spacing w:after="120" w:line="300"/>
+      </w:pPr>
+      <w:r>
+        <w:rPr>
+          <w:rFonts w:ascii="Microsoft JhengHei" w:eastAsia="Microsoft JhengHei" w:hAnsi="Microsoft JhengHei"/>
+          <w:sz w:val="22"/>
+          <w:szCs w:val="22"/>
+        </w:rPr>
+        <w:t xml:space="preserve">R 完全透過終端機使用，有兩種模式：</w:t>
+      </w:r>
+      <w:r>
+        <w:rPr>
+          <w:rFonts w:ascii="Microsoft JhengHei" w:eastAsia="Microsoft JhengHei" w:hAnsi="Microsoft JhengHei"/>
+          <w:b/>
+          <w:bCs/>
+          <w:sz w:val="22"/>
+          <w:szCs w:val="22"/>
+        </w:rPr>
+        <w:t xml:space="preserve">輸入 R 進入互動模式</w:t>
+      </w:r>
+      <w:r>
+        <w:rPr>
+          <w:rFonts w:ascii="Microsoft JhengHei" w:eastAsia="Microsoft JhengHei" w:hAnsi="Microsoft JhengHei"/>
+          <w:sz w:val="22"/>
+          <w:szCs w:val="22"/>
+        </w:rPr>
+        <w:t xml:space="preserve">（游標停在 </w:t>
+      </w:r>
+      <w:r>
+        <w:rPr>
+          <w:rFonts w:ascii="Consolas" w:eastAsia="Microsoft JhengHei" w:hAnsi="Consolas"/>
+          <w:sz w:val="20"/>
+          <w:szCs w:val="20"/>
+        </w:rPr>
+        <w:t xml:space="preserve">&gt;</w:t>
+      </w:r>
+      <w:r>
+        <w:rPr>
+          <w:rFonts w:ascii="Microsoft JhengHei" w:eastAsia="Microsoft JhengHei" w:hAnsi="Microsoft JhengHei"/>
+          <w:sz w:val="22"/>
+          <w:szCs w:val="22"/>
+        </w:rPr>
+        <w:t xml:space="preserve"> 後面，一句一句算，</w:t>
+      </w:r>
+      <w:r>
+        <w:rPr>
+          <w:rFonts w:ascii="Consolas" w:eastAsia="Microsoft JhengHei" w:hAnsi="Consolas"/>
+          <w:sz w:val="20"/>
+          <w:szCs w:val="20"/>
+        </w:rPr>
+        <w:t xml:space="preserve">q()</w:t>
+      </w:r>
+      <w:r>
+        <w:rPr>
+          <w:rFonts w:ascii="Microsoft JhengHei" w:eastAsia="Microsoft JhengHei" w:hAnsi="Microsoft JhengHei"/>
+          <w:sz w:val="22"/>
+          <w:szCs w:val="22"/>
+        </w:rPr>
+        <w:t xml:space="preserve"> 離開）；</w:t>
+      </w:r>
+      <w:r>
+        <w:rPr>
+          <w:rFonts w:ascii="Microsoft JhengHei" w:eastAsia="Microsoft JhengHei" w:hAnsi="Microsoft JhengHei"/>
+          <w:b/>
+          <w:bCs/>
+          <w:sz w:val="22"/>
+          <w:szCs w:val="22"/>
+        </w:rPr>
+        <w:t xml:space="preserve">輸入 Rscript 檔名.R 直接執行整個腳本</w:t>
+      </w:r>
+      <w:r>
+        <w:rPr>
+          <w:rFonts w:ascii="Microsoft JhengHei" w:eastAsia="Microsoft JhengHei" w:hAnsi="Microsoft JhengHei"/>
+          <w:sz w:val="22"/>
+          <w:szCs w:val="22"/>
+        </w:rPr>
+        <w:t xml:space="preserve">（工作坊當天跑 </w:t>
+      </w:r>
+      <w:r>
+        <w:rPr>
+          <w:rFonts w:ascii="Consolas" w:eastAsia="Microsoft JhengHei" w:hAnsi="Consolas"/>
+          <w:sz w:val="20"/>
+          <w:szCs w:val="20"/>
+        </w:rPr>
+        <w:t xml:space="preserve">Rscript run_all.R</w:t>
+      </w:r>
+      <w:r>
+        <w:rPr>
+          <w:rFonts w:ascii="Microsoft JhengHei" w:eastAsia="Microsoft JhengHei" w:hAnsi="Microsoft JhengHei"/>
+          <w:sz w:val="22"/>
+          <w:szCs w:val="22"/>
+        </w:rPr>
+        <w:t xml:space="preserve"> 就是這個）。想讓 .R 檔有語法上色，可以到活動列②的延伸模組搜尋「R」，安裝 REditorSupport 出的 R extension——加分但非必要。</w:t>
+      </w:r>
+    </w:p>
+    <w:p>
+      <w:pPr>
+        <w:spacing w:after="160" w:before="360"/>
+      </w:pPr>
+      <w:r>
+        <w:rPr>
+          <w:rFonts w:ascii="Microsoft JhengHei" w:eastAsia="Microsoft JhengHei" w:hAnsi="Microsoft JhengHei"/>
+          <w:b/>
+          <w:bCs/>
+          <w:color w:val="1F4E79"/>
+          <w:sz w:val="30"/>
+          <w:szCs w:val="30"/>
+        </w:rPr>
+        <w:t xml:space="preserve">5｜安裝 R 套件（需要網路，請課前完成）</w:t>
       </w:r>
     </w:p>
     <w:p>
@@ -2608,7 +3220,7 @@
           <w:sz w:val="30"/>
           <w:szCs w:val="30"/>
         </w:rPr>
-        <w:t xml:space="preserve">5｜自我檢查（三行指令，全過才算完成）</w:t>
+        <w:t xml:space="preserve">6｜自我檢查（三行指令，全過才算完成）</w:t>
       </w:r>
     </w:p>
     <w:p>
@@ -3013,7 +3625,7 @@
                 <w:sz w:val="20"/>
                 <w:szCs w:val="20"/>
               </w:rPr>
-              <w:t xml:space="preserve">哪個套件報錯就回到第 4 節單獨重裝它，例如 install.packages("plotly")</w:t>
+              <w:t xml:space="preserve">哪個套件報錯就回到第 5 節單獨重裝它，例如 install.packages("plotly")</w:t>
             </w:r>
           </w:p>
         </w:tc>
@@ -3183,7 +3795,7 @@
                     </pic:cNvPicPr>
                   </pic:nvPicPr>
                   <pic:blipFill>
-                    <a:blip r:embed="rId12" cstate="none"/>
+                    <a:blip r:embed="rId14" cstate="none"/>
                     <a:srcRect/>
                     <a:stretch>
                       <a:fillRect/>
@@ -3219,7 +3831,7 @@
           <w:sz w:val="18"/>
           <w:szCs w:val="18"/>
         </w:rPr>
-        <w:t xml:space="preserve">圖 6｜工作坊當天要 clone 的專案（github.com/SwaggyRoger/geothermal-doublet，Public）</w:t>
+        <w:t xml:space="preserve">圖 8｜工作坊當天要 clone 的專案（github.com/SwaggyRoger/geothermal-doublet，Public）</w:t>
       </w:r>
     </w:p>
     <w:sectPr>

</xml_diff>